<commit_message>
chỉnh sửa lại tên thành viên ở first_Plan
</commit_message>
<xml_diff>
--- a/doc/N04_1_ApplicationDevelopment_First Plan.docx
+++ b/doc/N04_1_ApplicationDevelopment_First Plan.docx
@@ -113,18 +113,8 @@
           <w:sz w:val="26"/>
           <w:szCs w:val="26"/>
         </w:rPr>
-        <w:t xml:space="preserve">- Thành viên </w:t>
+        <w:t>- Thành viên nhóm :</w:t>
       </w:r>
-      <w:proofErr w:type="gramStart"/>
-      <w:r>
-        <w:rPr>
-          <w:rFonts w:ascii="Times New Roman" w:hAnsi="Times New Roman" w:cs="Times New Roman"/>
-          <w:sz w:val="26"/>
-          <w:szCs w:val="26"/>
-        </w:rPr>
-        <w:t>nhóm :</w:t>
-      </w:r>
-      <w:proofErr w:type="gramEnd"/>
     </w:p>
     <w:p>
       <w:pPr>
@@ -1555,16 +1545,7 @@
                 <w:sz w:val="26"/>
                 <w:szCs w:val="26"/>
               </w:rPr>
-              <w:t xml:space="preserve"> về </w:t>
-            </w:r>
-            <w:r>
-              <w:rPr>
-                <w:rFonts w:ascii="Times New Roman" w:hAnsi="Times New Roman" w:cs="Times New Roman"/>
-                <w:bCs/>
-                <w:sz w:val="26"/>
-                <w:szCs w:val="26"/>
-              </w:rPr>
-              <w:t>lịch hẹn và tiếp nhận.</w:t>
+              <w:t xml:space="preserve"> về lịch hẹn và tiếp nhận.</w:t>
             </w:r>
           </w:p>
           <w:p>
@@ -1752,16 +1733,7 @@
                 <w:sz w:val="26"/>
                 <w:szCs w:val="26"/>
               </w:rPr>
-              <w:t xml:space="preserve"> về </w:t>
-            </w:r>
-            <w:r>
-              <w:rPr>
-                <w:rFonts w:ascii="Times New Roman" w:hAnsi="Times New Roman" w:cs="Times New Roman"/>
-                <w:bCs/>
-                <w:sz w:val="26"/>
-                <w:szCs w:val="26"/>
-              </w:rPr>
-              <w:t>khám và chẩn đoán.</w:t>
+              <w:t xml:space="preserve"> về khám và chẩn đoán.</w:t>
             </w:r>
           </w:p>
           <w:p>
@@ -1949,16 +1921,7 @@
                 <w:sz w:val="26"/>
                 <w:szCs w:val="26"/>
               </w:rPr>
-              <w:t xml:space="preserve"> về </w:t>
-            </w:r>
-            <w:r>
-              <w:rPr>
-                <w:rFonts w:ascii="Times New Roman" w:hAnsi="Times New Roman" w:cs="Times New Roman"/>
-                <w:bCs/>
-                <w:sz w:val="26"/>
-                <w:szCs w:val="26"/>
-              </w:rPr>
-              <w:t>điều trị và tái khám.</w:t>
+              <w:t xml:space="preserve"> về điều trị và tái khám.</w:t>
             </w:r>
           </w:p>
           <w:p>
@@ -2156,16 +2119,7 @@
                 <w:sz w:val="26"/>
                 <w:szCs w:val="26"/>
               </w:rPr>
-              <w:t xml:space="preserve"> </w:t>
-            </w:r>
-            <w:r>
-              <w:rPr>
-                <w:rFonts w:ascii="Times New Roman" w:hAnsi="Times New Roman" w:cs="Times New Roman"/>
-                <w:bCs/>
-                <w:sz w:val="26"/>
-                <w:szCs w:val="26"/>
-              </w:rPr>
-              <w:t>về thanh toán, quản lý.</w:t>
+              <w:t xml:space="preserve"> về thanh toán, quản lý.</w:t>
             </w:r>
           </w:p>
           <w:p>
@@ -4719,7 +4673,7 @@
                 <w:sz w:val="26"/>
                 <w:szCs w:val="26"/>
               </w:rPr>
-              <w:t>Lê Trần Quang Thanh</w:t>
+              <w:t>Nguyễn Minh Lý</w:t>
             </w:r>
           </w:p>
         </w:tc>
@@ -7470,25 +7424,7 @@
                 <w:sz w:val="26"/>
                 <w:szCs w:val="26"/>
               </w:rPr>
-              <w:t xml:space="preserve">: </w:t>
-            </w:r>
-            <w:proofErr w:type="gramStart"/>
-            <w:r>
-              <w:rPr>
-                <w:rFonts w:ascii="Times New Roman" w:hAnsi="Times New Roman" w:cs="Times New Roman"/>
-                <w:sz w:val="26"/>
-                <w:szCs w:val="26"/>
-              </w:rPr>
-              <w:t xml:space="preserve"> ../..</w:t>
-            </w:r>
-            <w:proofErr w:type="gramEnd"/>
-            <w:r>
-              <w:rPr>
-                <w:rFonts w:ascii="Times New Roman" w:hAnsi="Times New Roman" w:cs="Times New Roman"/>
-                <w:sz w:val="26"/>
-                <w:szCs w:val="26"/>
-              </w:rPr>
-              <w:t>/20</w:t>
+              <w:t>:  ../../20</w:t>
             </w:r>
             <w:r>
               <w:rPr>
@@ -7513,16 +7449,7 @@
                 <w:sz w:val="26"/>
                 <w:szCs w:val="26"/>
               </w:rPr>
-              <w:t xml:space="preserve">Đến: </w:t>
-            </w:r>
-            <w:proofErr w:type="gramStart"/>
-            <w:r>
-              <w:rPr>
-                <w:rFonts w:ascii="Times New Roman" w:hAnsi="Times New Roman" w:cs="Times New Roman"/>
-                <w:sz w:val="26"/>
-                <w:szCs w:val="26"/>
-              </w:rPr>
-              <w:t xml:space="preserve"> </w:t>
+              <w:t xml:space="preserve">Đến:  </w:t>
             </w:r>
             <w:r>
               <w:rPr>
@@ -7530,16 +7457,7 @@
                 <w:sz w:val="26"/>
                 <w:szCs w:val="26"/>
               </w:rPr>
-              <w:t>../..</w:t>
-            </w:r>
-            <w:proofErr w:type="gramEnd"/>
-            <w:r>
-              <w:rPr>
-                <w:rFonts w:ascii="Times New Roman" w:hAnsi="Times New Roman" w:cs="Times New Roman"/>
-                <w:sz w:val="26"/>
-                <w:szCs w:val="26"/>
-              </w:rPr>
-              <w:t>/20</w:t>
+              <w:t>../../20</w:t>
             </w:r>
             <w:r>
               <w:rPr>
@@ -9073,25 +8991,7 @@
                 <w:sz w:val="26"/>
                 <w:szCs w:val="26"/>
               </w:rPr>
-              <w:t xml:space="preserve">: </w:t>
-            </w:r>
-            <w:proofErr w:type="gramStart"/>
-            <w:r>
-              <w:rPr>
-                <w:rFonts w:ascii="Times New Roman" w:hAnsi="Times New Roman" w:cs="Times New Roman"/>
-                <w:sz w:val="26"/>
-                <w:szCs w:val="26"/>
-              </w:rPr>
-              <w:t xml:space="preserve"> ../..</w:t>
-            </w:r>
-            <w:proofErr w:type="gramEnd"/>
-            <w:r>
-              <w:rPr>
-                <w:rFonts w:ascii="Times New Roman" w:hAnsi="Times New Roman" w:cs="Times New Roman"/>
-                <w:sz w:val="26"/>
-                <w:szCs w:val="26"/>
-              </w:rPr>
-              <w:t>/20</w:t>
+              <w:t>:  ../../20</w:t>
             </w:r>
             <w:r>
               <w:rPr>
@@ -9116,16 +9016,7 @@
                 <w:sz w:val="26"/>
                 <w:szCs w:val="26"/>
               </w:rPr>
-              <w:t xml:space="preserve">Đến: </w:t>
-            </w:r>
-            <w:proofErr w:type="gramStart"/>
-            <w:r>
-              <w:rPr>
-                <w:rFonts w:ascii="Times New Roman" w:hAnsi="Times New Roman" w:cs="Times New Roman"/>
-                <w:sz w:val="26"/>
-                <w:szCs w:val="26"/>
-              </w:rPr>
-              <w:t xml:space="preserve"> </w:t>
+              <w:t xml:space="preserve">Đến:  </w:t>
             </w:r>
             <w:r>
               <w:rPr>
@@ -9133,16 +9024,7 @@
                 <w:sz w:val="26"/>
                 <w:szCs w:val="26"/>
               </w:rPr>
-              <w:t>../..</w:t>
-            </w:r>
-            <w:proofErr w:type="gramEnd"/>
-            <w:r>
-              <w:rPr>
-                <w:rFonts w:ascii="Times New Roman" w:hAnsi="Times New Roman" w:cs="Times New Roman"/>
-                <w:sz w:val="26"/>
-                <w:szCs w:val="26"/>
-              </w:rPr>
-              <w:t>/20</w:t>
+              <w:t>../../20</w:t>
             </w:r>
             <w:r>
               <w:rPr>
@@ -10790,25 +10672,7 @@
                 <w:sz w:val="26"/>
                 <w:szCs w:val="26"/>
               </w:rPr>
-              <w:t xml:space="preserve">: </w:t>
-            </w:r>
-            <w:proofErr w:type="gramStart"/>
-            <w:r>
-              <w:rPr>
-                <w:rFonts w:ascii="Times New Roman" w:hAnsi="Times New Roman" w:cs="Times New Roman"/>
-                <w:sz w:val="26"/>
-                <w:szCs w:val="26"/>
-              </w:rPr>
-              <w:t xml:space="preserve"> ../..</w:t>
-            </w:r>
-            <w:proofErr w:type="gramEnd"/>
-            <w:r>
-              <w:rPr>
-                <w:rFonts w:ascii="Times New Roman" w:hAnsi="Times New Roman" w:cs="Times New Roman"/>
-                <w:sz w:val="26"/>
-                <w:szCs w:val="26"/>
-              </w:rPr>
-              <w:t>/20</w:t>
+              <w:t>:  ../../20</w:t>
             </w:r>
             <w:r>
               <w:rPr>
@@ -10833,16 +10697,7 @@
                 <w:sz w:val="26"/>
                 <w:szCs w:val="26"/>
               </w:rPr>
-              <w:t xml:space="preserve">Đến: </w:t>
-            </w:r>
-            <w:proofErr w:type="gramStart"/>
-            <w:r>
-              <w:rPr>
-                <w:rFonts w:ascii="Times New Roman" w:hAnsi="Times New Roman" w:cs="Times New Roman"/>
-                <w:sz w:val="26"/>
-                <w:szCs w:val="26"/>
-              </w:rPr>
-              <w:t xml:space="preserve"> </w:t>
+              <w:t xml:space="preserve">Đến:  </w:t>
             </w:r>
             <w:r>
               <w:rPr>
@@ -10850,16 +10705,7 @@
                 <w:sz w:val="26"/>
                 <w:szCs w:val="26"/>
               </w:rPr>
-              <w:t>../..</w:t>
-            </w:r>
-            <w:proofErr w:type="gramEnd"/>
-            <w:r>
-              <w:rPr>
-                <w:rFonts w:ascii="Times New Roman" w:hAnsi="Times New Roman" w:cs="Times New Roman"/>
-                <w:sz w:val="26"/>
-                <w:szCs w:val="26"/>
-              </w:rPr>
-              <w:t>/20</w:t>
+              <w:t>../../20</w:t>
             </w:r>
             <w:r>
               <w:rPr>
@@ -12507,25 +12353,7 @@
                 <w:sz w:val="26"/>
                 <w:szCs w:val="26"/>
               </w:rPr>
-              <w:t xml:space="preserve">: </w:t>
-            </w:r>
-            <w:proofErr w:type="gramStart"/>
-            <w:r>
-              <w:rPr>
-                <w:rFonts w:ascii="Times New Roman" w:hAnsi="Times New Roman" w:cs="Times New Roman"/>
-                <w:sz w:val="26"/>
-                <w:szCs w:val="26"/>
-              </w:rPr>
-              <w:t xml:space="preserve"> ../..</w:t>
-            </w:r>
-            <w:proofErr w:type="gramEnd"/>
-            <w:r>
-              <w:rPr>
-                <w:rFonts w:ascii="Times New Roman" w:hAnsi="Times New Roman" w:cs="Times New Roman"/>
-                <w:sz w:val="26"/>
-                <w:szCs w:val="26"/>
-              </w:rPr>
-              <w:t>/20</w:t>
+              <w:t>:  ../../20</w:t>
             </w:r>
             <w:r>
               <w:rPr>
@@ -12550,16 +12378,7 @@
                 <w:sz w:val="26"/>
                 <w:szCs w:val="26"/>
               </w:rPr>
-              <w:t xml:space="preserve">Đến: </w:t>
-            </w:r>
-            <w:proofErr w:type="gramStart"/>
-            <w:r>
-              <w:rPr>
-                <w:rFonts w:ascii="Times New Roman" w:hAnsi="Times New Roman" w:cs="Times New Roman"/>
-                <w:sz w:val="26"/>
-                <w:szCs w:val="26"/>
-              </w:rPr>
-              <w:t xml:space="preserve"> </w:t>
+              <w:t xml:space="preserve">Đến:  </w:t>
             </w:r>
             <w:r>
               <w:rPr>
@@ -12567,16 +12386,7 @@
                 <w:sz w:val="26"/>
                 <w:szCs w:val="26"/>
               </w:rPr>
-              <w:t>../..</w:t>
-            </w:r>
-            <w:proofErr w:type="gramEnd"/>
-            <w:r>
-              <w:rPr>
-                <w:rFonts w:ascii="Times New Roman" w:hAnsi="Times New Roman" w:cs="Times New Roman"/>
-                <w:sz w:val="26"/>
-                <w:szCs w:val="26"/>
-              </w:rPr>
-              <w:t>/20</w:t>
+              <w:t>../../20</w:t>
             </w:r>
             <w:r>
               <w:rPr>
@@ -14110,25 +13920,7 @@
                 <w:sz w:val="26"/>
                 <w:szCs w:val="26"/>
               </w:rPr>
-              <w:t xml:space="preserve">: </w:t>
-            </w:r>
-            <w:proofErr w:type="gramStart"/>
-            <w:r>
-              <w:rPr>
-                <w:rFonts w:ascii="Times New Roman" w:hAnsi="Times New Roman" w:cs="Times New Roman"/>
-                <w:sz w:val="26"/>
-                <w:szCs w:val="26"/>
-              </w:rPr>
-              <w:t xml:space="preserve"> ../..</w:t>
-            </w:r>
-            <w:proofErr w:type="gramEnd"/>
-            <w:r>
-              <w:rPr>
-                <w:rFonts w:ascii="Times New Roman" w:hAnsi="Times New Roman" w:cs="Times New Roman"/>
-                <w:sz w:val="26"/>
-                <w:szCs w:val="26"/>
-              </w:rPr>
-              <w:t>/20</w:t>
+              <w:t>:  ../../20</w:t>
             </w:r>
             <w:r>
               <w:rPr>
@@ -14153,16 +13945,7 @@
                 <w:sz w:val="26"/>
                 <w:szCs w:val="26"/>
               </w:rPr>
-              <w:t xml:space="preserve">Đến: </w:t>
-            </w:r>
-            <w:proofErr w:type="gramStart"/>
-            <w:r>
-              <w:rPr>
-                <w:rFonts w:ascii="Times New Roman" w:hAnsi="Times New Roman" w:cs="Times New Roman"/>
-                <w:sz w:val="26"/>
-                <w:szCs w:val="26"/>
-              </w:rPr>
-              <w:t xml:space="preserve"> </w:t>
+              <w:t xml:space="preserve">Đến:  </w:t>
             </w:r>
             <w:r>
               <w:rPr>
@@ -14170,16 +13953,7 @@
                 <w:sz w:val="26"/>
                 <w:szCs w:val="26"/>
               </w:rPr>
-              <w:t>../..</w:t>
-            </w:r>
-            <w:proofErr w:type="gramEnd"/>
-            <w:r>
-              <w:rPr>
-                <w:rFonts w:ascii="Times New Roman" w:hAnsi="Times New Roman" w:cs="Times New Roman"/>
-                <w:sz w:val="26"/>
-                <w:szCs w:val="26"/>
-              </w:rPr>
-              <w:t>/20</w:t>
+              <w:t>../../20</w:t>
             </w:r>
             <w:r>
               <w:rPr>
@@ -15713,25 +15487,7 @@
                 <w:sz w:val="26"/>
                 <w:szCs w:val="26"/>
               </w:rPr>
-              <w:t xml:space="preserve">: </w:t>
-            </w:r>
-            <w:proofErr w:type="gramStart"/>
-            <w:r>
-              <w:rPr>
-                <w:rFonts w:ascii="Times New Roman" w:hAnsi="Times New Roman" w:cs="Times New Roman"/>
-                <w:sz w:val="26"/>
-                <w:szCs w:val="26"/>
-              </w:rPr>
-              <w:t xml:space="preserve"> ../..</w:t>
-            </w:r>
-            <w:proofErr w:type="gramEnd"/>
-            <w:r>
-              <w:rPr>
-                <w:rFonts w:ascii="Times New Roman" w:hAnsi="Times New Roman" w:cs="Times New Roman"/>
-                <w:sz w:val="26"/>
-                <w:szCs w:val="26"/>
-              </w:rPr>
-              <w:t>/20</w:t>
+              <w:t>:  ../../20</w:t>
             </w:r>
             <w:r>
               <w:rPr>
@@ -15756,16 +15512,7 @@
                 <w:sz w:val="26"/>
                 <w:szCs w:val="26"/>
               </w:rPr>
-              <w:t xml:space="preserve">Đến: </w:t>
-            </w:r>
-            <w:proofErr w:type="gramStart"/>
-            <w:r>
-              <w:rPr>
-                <w:rFonts w:ascii="Times New Roman" w:hAnsi="Times New Roman" w:cs="Times New Roman"/>
-                <w:sz w:val="26"/>
-                <w:szCs w:val="26"/>
-              </w:rPr>
-              <w:t xml:space="preserve"> </w:t>
+              <w:t xml:space="preserve">Đến:  </w:t>
             </w:r>
             <w:r>
               <w:rPr>
@@ -15773,16 +15520,7 @@
                 <w:sz w:val="26"/>
                 <w:szCs w:val="26"/>
               </w:rPr>
-              <w:t>../..</w:t>
-            </w:r>
-            <w:proofErr w:type="gramEnd"/>
-            <w:r>
-              <w:rPr>
-                <w:rFonts w:ascii="Times New Roman" w:hAnsi="Times New Roman" w:cs="Times New Roman"/>
-                <w:sz w:val="26"/>
-                <w:szCs w:val="26"/>
-              </w:rPr>
-              <w:t>/20</w:t>
+              <w:t>../../20</w:t>
             </w:r>
             <w:r>
               <w:rPr>
@@ -17430,25 +17168,7 @@
                 <w:sz w:val="26"/>
                 <w:szCs w:val="26"/>
               </w:rPr>
-              <w:t xml:space="preserve">: </w:t>
-            </w:r>
-            <w:proofErr w:type="gramStart"/>
-            <w:r>
-              <w:rPr>
-                <w:rFonts w:ascii="Times New Roman" w:hAnsi="Times New Roman" w:cs="Times New Roman"/>
-                <w:sz w:val="26"/>
-                <w:szCs w:val="26"/>
-              </w:rPr>
-              <w:t xml:space="preserve"> ../..</w:t>
-            </w:r>
-            <w:proofErr w:type="gramEnd"/>
-            <w:r>
-              <w:rPr>
-                <w:rFonts w:ascii="Times New Roman" w:hAnsi="Times New Roman" w:cs="Times New Roman"/>
-                <w:sz w:val="26"/>
-                <w:szCs w:val="26"/>
-              </w:rPr>
-              <w:t>/20</w:t>
+              <w:t>:  ../../20</w:t>
             </w:r>
             <w:r>
               <w:rPr>
@@ -17473,16 +17193,7 @@
                 <w:sz w:val="26"/>
                 <w:szCs w:val="26"/>
               </w:rPr>
-              <w:t xml:space="preserve">Đến: </w:t>
-            </w:r>
-            <w:proofErr w:type="gramStart"/>
-            <w:r>
-              <w:rPr>
-                <w:rFonts w:ascii="Times New Roman" w:hAnsi="Times New Roman" w:cs="Times New Roman"/>
-                <w:sz w:val="26"/>
-                <w:szCs w:val="26"/>
-              </w:rPr>
-              <w:t xml:space="preserve"> </w:t>
+              <w:t xml:space="preserve">Đến:  </w:t>
             </w:r>
             <w:r>
               <w:rPr>
@@ -17490,16 +17201,7 @@
                 <w:sz w:val="26"/>
                 <w:szCs w:val="26"/>
               </w:rPr>
-              <w:t>../..</w:t>
-            </w:r>
-            <w:proofErr w:type="gramEnd"/>
-            <w:r>
-              <w:rPr>
-                <w:rFonts w:ascii="Times New Roman" w:hAnsi="Times New Roman" w:cs="Times New Roman"/>
-                <w:sz w:val="26"/>
-                <w:szCs w:val="26"/>
-              </w:rPr>
-              <w:t>/20</w:t>
+              <w:t>../../20</w:t>
             </w:r>
             <w:r>
               <w:rPr>
@@ -19140,25 +18842,7 @@
                 <w:sz w:val="26"/>
                 <w:szCs w:val="26"/>
               </w:rPr>
-              <w:t xml:space="preserve">: </w:t>
-            </w:r>
-            <w:proofErr w:type="gramStart"/>
-            <w:r>
-              <w:rPr>
-                <w:rFonts w:ascii="Times New Roman" w:hAnsi="Times New Roman" w:cs="Times New Roman"/>
-                <w:sz w:val="26"/>
-                <w:szCs w:val="26"/>
-              </w:rPr>
-              <w:t xml:space="preserve"> ../..</w:t>
-            </w:r>
-            <w:proofErr w:type="gramEnd"/>
-            <w:r>
-              <w:rPr>
-                <w:rFonts w:ascii="Times New Roman" w:hAnsi="Times New Roman" w:cs="Times New Roman"/>
-                <w:sz w:val="26"/>
-                <w:szCs w:val="26"/>
-              </w:rPr>
-              <w:t>/20</w:t>
+              <w:t>:  ../../20</w:t>
             </w:r>
             <w:r>
               <w:rPr>
@@ -19183,16 +18867,7 @@
                 <w:sz w:val="26"/>
                 <w:szCs w:val="26"/>
               </w:rPr>
-              <w:t xml:space="preserve">Đến: </w:t>
-            </w:r>
-            <w:proofErr w:type="gramStart"/>
-            <w:r>
-              <w:rPr>
-                <w:rFonts w:ascii="Times New Roman" w:hAnsi="Times New Roman" w:cs="Times New Roman"/>
-                <w:sz w:val="26"/>
-                <w:szCs w:val="26"/>
-              </w:rPr>
-              <w:t xml:space="preserve"> </w:t>
+              <w:t xml:space="preserve">Đến:  </w:t>
             </w:r>
             <w:r>
               <w:rPr>
@@ -19200,16 +18875,7 @@
                 <w:sz w:val="26"/>
                 <w:szCs w:val="26"/>
               </w:rPr>
-              <w:t>../..</w:t>
-            </w:r>
-            <w:proofErr w:type="gramEnd"/>
-            <w:r>
-              <w:rPr>
-                <w:rFonts w:ascii="Times New Roman" w:hAnsi="Times New Roman" w:cs="Times New Roman"/>
-                <w:sz w:val="26"/>
-                <w:szCs w:val="26"/>
-              </w:rPr>
-              <w:t>/20</w:t>
+              <w:t>../../20</w:t>
             </w:r>
             <w:r>
               <w:rPr>
@@ -20977,25 +20643,7 @@
                 <w:sz w:val="26"/>
                 <w:szCs w:val="26"/>
               </w:rPr>
-              <w:t xml:space="preserve">: </w:t>
-            </w:r>
-            <w:proofErr w:type="gramStart"/>
-            <w:r>
-              <w:rPr>
-                <w:rFonts w:ascii="Times New Roman" w:hAnsi="Times New Roman" w:cs="Times New Roman"/>
-                <w:sz w:val="26"/>
-                <w:szCs w:val="26"/>
-              </w:rPr>
-              <w:t xml:space="preserve"> ../..</w:t>
-            </w:r>
-            <w:proofErr w:type="gramEnd"/>
-            <w:r>
-              <w:rPr>
-                <w:rFonts w:ascii="Times New Roman" w:hAnsi="Times New Roman" w:cs="Times New Roman"/>
-                <w:sz w:val="26"/>
-                <w:szCs w:val="26"/>
-              </w:rPr>
-              <w:t>/20</w:t>
+              <w:t>:  ../../20</w:t>
             </w:r>
             <w:r>
               <w:rPr>
@@ -21020,16 +20668,7 @@
                 <w:sz w:val="26"/>
                 <w:szCs w:val="26"/>
               </w:rPr>
-              <w:t xml:space="preserve">Đến: </w:t>
-            </w:r>
-            <w:proofErr w:type="gramStart"/>
-            <w:r>
-              <w:rPr>
-                <w:rFonts w:ascii="Times New Roman" w:hAnsi="Times New Roman" w:cs="Times New Roman"/>
-                <w:sz w:val="26"/>
-                <w:szCs w:val="26"/>
-              </w:rPr>
-              <w:t xml:space="preserve"> </w:t>
+              <w:t xml:space="preserve">Đến:  </w:t>
             </w:r>
             <w:r>
               <w:rPr>
@@ -21037,16 +20676,7 @@
                 <w:sz w:val="26"/>
                 <w:szCs w:val="26"/>
               </w:rPr>
-              <w:t>../..</w:t>
-            </w:r>
-            <w:proofErr w:type="gramEnd"/>
-            <w:r>
-              <w:rPr>
-                <w:rFonts w:ascii="Times New Roman" w:hAnsi="Times New Roman" w:cs="Times New Roman"/>
-                <w:sz w:val="26"/>
-                <w:szCs w:val="26"/>
-              </w:rPr>
-              <w:t>/20</w:t>
+              <w:t>../../20</w:t>
             </w:r>
             <w:r>
               <w:rPr>
@@ -22696,25 +22326,7 @@
                 <w:sz w:val="26"/>
                 <w:szCs w:val="26"/>
               </w:rPr>
-              <w:t xml:space="preserve">: </w:t>
-            </w:r>
-            <w:proofErr w:type="gramStart"/>
-            <w:r>
-              <w:rPr>
-                <w:rFonts w:ascii="Times New Roman" w:hAnsi="Times New Roman" w:cs="Times New Roman"/>
-                <w:sz w:val="26"/>
-                <w:szCs w:val="26"/>
-              </w:rPr>
-              <w:t xml:space="preserve"> ../..</w:t>
-            </w:r>
-            <w:proofErr w:type="gramEnd"/>
-            <w:r>
-              <w:rPr>
-                <w:rFonts w:ascii="Times New Roman" w:hAnsi="Times New Roman" w:cs="Times New Roman"/>
-                <w:sz w:val="26"/>
-                <w:szCs w:val="26"/>
-              </w:rPr>
-              <w:t>/20</w:t>
+              <w:t>:  ../../20</w:t>
             </w:r>
             <w:r>
               <w:rPr>
@@ -22739,16 +22351,7 @@
                 <w:sz w:val="26"/>
                 <w:szCs w:val="26"/>
               </w:rPr>
-              <w:t xml:space="preserve">Đến: </w:t>
-            </w:r>
-            <w:proofErr w:type="gramStart"/>
-            <w:r>
-              <w:rPr>
-                <w:rFonts w:ascii="Times New Roman" w:hAnsi="Times New Roman" w:cs="Times New Roman"/>
-                <w:sz w:val="26"/>
-                <w:szCs w:val="26"/>
-              </w:rPr>
-              <w:t xml:space="preserve"> </w:t>
+              <w:t xml:space="preserve">Đến:  </w:t>
             </w:r>
             <w:r>
               <w:rPr>
@@ -22756,16 +22359,7 @@
                 <w:sz w:val="26"/>
                 <w:szCs w:val="26"/>
               </w:rPr>
-              <w:t>../..</w:t>
-            </w:r>
-            <w:proofErr w:type="gramEnd"/>
-            <w:r>
-              <w:rPr>
-                <w:rFonts w:ascii="Times New Roman" w:hAnsi="Times New Roman" w:cs="Times New Roman"/>
-                <w:sz w:val="26"/>
-                <w:szCs w:val="26"/>
-              </w:rPr>
-              <w:t>/20</w:t>
+              <w:t>../../20</w:t>
             </w:r>
             <w:r>
               <w:rPr>
@@ -24647,25 +24241,7 @@
                 <w:sz w:val="26"/>
                 <w:szCs w:val="26"/>
               </w:rPr>
-              <w:t xml:space="preserve">: </w:t>
-            </w:r>
-            <w:proofErr w:type="gramStart"/>
-            <w:r>
-              <w:rPr>
-                <w:rFonts w:ascii="Times New Roman" w:hAnsi="Times New Roman" w:cs="Times New Roman"/>
-                <w:sz w:val="26"/>
-                <w:szCs w:val="26"/>
-              </w:rPr>
-              <w:t xml:space="preserve"> ../..</w:t>
-            </w:r>
-            <w:proofErr w:type="gramEnd"/>
-            <w:r>
-              <w:rPr>
-                <w:rFonts w:ascii="Times New Roman" w:hAnsi="Times New Roman" w:cs="Times New Roman"/>
-                <w:sz w:val="26"/>
-                <w:szCs w:val="26"/>
-              </w:rPr>
-              <w:t>/20</w:t>
+              <w:t>:  ../../20</w:t>
             </w:r>
             <w:r>
               <w:rPr>
@@ -24690,16 +24266,7 @@
                 <w:sz w:val="26"/>
                 <w:szCs w:val="26"/>
               </w:rPr>
-              <w:t xml:space="preserve">Đến: </w:t>
-            </w:r>
-            <w:proofErr w:type="gramStart"/>
-            <w:r>
-              <w:rPr>
-                <w:rFonts w:ascii="Times New Roman" w:hAnsi="Times New Roman" w:cs="Times New Roman"/>
-                <w:sz w:val="26"/>
-                <w:szCs w:val="26"/>
-              </w:rPr>
-              <w:t xml:space="preserve"> </w:t>
+              <w:t xml:space="preserve">Đến:  </w:t>
             </w:r>
             <w:r>
               <w:rPr>
@@ -24707,16 +24274,7 @@
                 <w:sz w:val="26"/>
                 <w:szCs w:val="26"/>
               </w:rPr>
-              <w:t>../..</w:t>
-            </w:r>
-            <w:proofErr w:type="gramEnd"/>
-            <w:r>
-              <w:rPr>
-                <w:rFonts w:ascii="Times New Roman" w:hAnsi="Times New Roman" w:cs="Times New Roman"/>
-                <w:sz w:val="26"/>
-                <w:szCs w:val="26"/>
-              </w:rPr>
-              <w:t>/20</w:t>
+              <w:t>../../20</w:t>
             </w:r>
             <w:r>
               <w:rPr>
@@ -25335,25 +24893,7 @@
                 <w:sz w:val="26"/>
                 <w:szCs w:val="26"/>
               </w:rPr>
-              <w:t xml:space="preserve">: </w:t>
-            </w:r>
-            <w:proofErr w:type="gramStart"/>
-            <w:r>
-              <w:rPr>
-                <w:rFonts w:ascii="Times New Roman" w:hAnsi="Times New Roman" w:cs="Times New Roman"/>
-                <w:sz w:val="26"/>
-                <w:szCs w:val="26"/>
-              </w:rPr>
-              <w:t xml:space="preserve"> ../..</w:t>
-            </w:r>
-            <w:proofErr w:type="gramEnd"/>
-            <w:r>
-              <w:rPr>
-                <w:rFonts w:ascii="Times New Roman" w:hAnsi="Times New Roman" w:cs="Times New Roman"/>
-                <w:sz w:val="26"/>
-                <w:szCs w:val="26"/>
-              </w:rPr>
-              <w:t>/20</w:t>
+              <w:t>:  ../../20</w:t>
             </w:r>
             <w:r>
               <w:rPr>
@@ -25378,16 +24918,7 @@
                 <w:sz w:val="26"/>
                 <w:szCs w:val="26"/>
               </w:rPr>
-              <w:t xml:space="preserve">Đến: </w:t>
-            </w:r>
-            <w:proofErr w:type="gramStart"/>
-            <w:r>
-              <w:rPr>
-                <w:rFonts w:ascii="Times New Roman" w:hAnsi="Times New Roman" w:cs="Times New Roman"/>
-                <w:sz w:val="26"/>
-                <w:szCs w:val="26"/>
-              </w:rPr>
-              <w:t xml:space="preserve"> </w:t>
+              <w:t xml:space="preserve">Đến:  </w:t>
             </w:r>
             <w:r>
               <w:rPr>
@@ -25395,16 +24926,7 @@
                 <w:sz w:val="26"/>
                 <w:szCs w:val="26"/>
               </w:rPr>
-              <w:t>../..</w:t>
-            </w:r>
-            <w:proofErr w:type="gramEnd"/>
-            <w:r>
-              <w:rPr>
-                <w:rFonts w:ascii="Times New Roman" w:hAnsi="Times New Roman" w:cs="Times New Roman"/>
-                <w:sz w:val="26"/>
-                <w:szCs w:val="26"/>
-              </w:rPr>
-              <w:t>/20</w:t>
+              <w:t>../../20</w:t>
             </w:r>
             <w:r>
               <w:rPr>

</xml_diff>